<commit_message>
Topic proposal V2 with light B2-level language edits
Co-Authored-By: Claude Opus 5.5 <noreply@anthropic.com>
Claude-Session: https://claude.ai/code/session_01F5eVZgJmTJXmvKYhzhS49t
</commit_message>
<xml_diff>
--- a/thesis/thesis-topic-proposal.docx
+++ b/thesis/thesis-topic-proposal.docx
@@ -7,24 +7,39 @@
         <w:pStyle w:val="Title"/>
         <w:spacing w:after="80"/>
         <w:jc w:val="center"/>
-      </w:pPr>
-      <w:r>
+        <w:rPr>
+          <w:rFonts w:ascii="Times New Roman" w:hAnsi="Times New Roman" w:cs="Times New Roman"/>
+        </w:rPr>
+      </w:pPr>
+      <w:r>
+        <w:rPr>
+          <w:rFonts w:ascii="Times New Roman" w:hAnsi="Times New Roman" w:cs="Times New Roman"/>
+        </w:rPr>
         <w:t>Thesis topic proposal</w:t>
       </w:r>
     </w:p>
     <w:p>
       <w:pPr>
-        <w:pStyle w:val="Heading2"/>
-        <w:keepNext/>
-        <w:pBdr>
-          <w:bottom w:val="single" w:sz="4" w:space="4" w:color="D9D9D9"/>
-        </w:pBdr>
-        <w:spacing w:before="360" w:after="80"/>
-      </w:pPr>
-      <w:r>
+        <w:rPr>
+          <w:rFonts w:ascii="Times New Roman" w:hAnsi="Times New Roman" w:cs="Times New Roman"/>
+          <w:b/>
+          <w:bCs/>
+          <w:sz w:val="28"/>
+          <w:szCs w:val="28"/>
+        </w:rPr>
+      </w:pPr>
+      <w:r>
+        <w:rPr>
+          <w:rFonts w:ascii="Times New Roman" w:hAnsi="Times New Roman" w:cs="Times New Roman"/>
+          <w:b/>
+          <w:bCs/>
+          <w:sz w:val="28"/>
+          <w:szCs w:val="28"/>
+        </w:rPr>
         <w:t>Thesis information</w:t>
       </w:r>
     </w:p>
+    <w:p/>
     <w:tbl>
       <w:tblPr>
         <w:tblStyle w:val="TableGrid"/>
@@ -32,13 +47,13 @@
         <w:tblLook w:val="0000" w:firstRow="0" w:lastRow="0" w:firstColumn="0" w:lastColumn="0" w:noHBand="0" w:noVBand="0"/>
       </w:tblPr>
       <w:tblGrid>
-        <w:gridCol w:w="2515"/>
-        <w:gridCol w:w="6511"/>
+        <w:gridCol w:w="3145"/>
+        <w:gridCol w:w="5881"/>
       </w:tblGrid>
       <w:tr>
         <w:tc>
           <w:tcPr>
-            <w:tcW w:w="2515" w:type="dxa"/>
+            <w:tcW w:w="3145" w:type="dxa"/>
           </w:tcPr>
           <w:p>
             <w:pPr>
@@ -64,7 +79,7 @@
         </w:tc>
         <w:tc>
           <w:tcPr>
-            <w:tcW w:w="6511" w:type="dxa"/>
+            <w:tcW w:w="5881" w:type="dxa"/>
           </w:tcPr>
           <w:p>
             <w:pPr>
@@ -90,7 +105,7 @@
       <w:tr>
         <w:tc>
           <w:tcPr>
-            <w:tcW w:w="2515" w:type="dxa"/>
+            <w:tcW w:w="3145" w:type="dxa"/>
           </w:tcPr>
           <w:p>
             <w:pPr>
@@ -116,7 +131,7 @@
         </w:tc>
         <w:tc>
           <w:tcPr>
-            <w:tcW w:w="6511" w:type="dxa"/>
+            <w:tcW w:w="5881" w:type="dxa"/>
           </w:tcPr>
           <w:p>
             <w:pPr>
@@ -142,7 +157,7 @@
       <w:tr>
         <w:tc>
           <w:tcPr>
-            <w:tcW w:w="2515" w:type="dxa"/>
+            <w:tcW w:w="3145" w:type="dxa"/>
           </w:tcPr>
           <w:p>
             <w:pPr>
@@ -168,7 +183,7 @@
         </w:tc>
         <w:tc>
           <w:tcPr>
-            <w:tcW w:w="6511" w:type="dxa"/>
+            <w:tcW w:w="5881" w:type="dxa"/>
           </w:tcPr>
           <w:p>
             <w:pPr>
@@ -187,7 +202,7 @@
                 <w:szCs w:val="24"/>
                 <w:highlight w:val="yellow"/>
               </w:rPr>
-              <w:t xml:space="preserve">[your program’s specialization option]</w:t>
+              <w:t>[your program’s specialization option]</w:t>
             </w:r>
           </w:p>
         </w:tc>
@@ -195,7 +210,7 @@
       <w:tr>
         <w:tc>
           <w:tcPr>
-            <w:tcW w:w="2515" w:type="dxa"/>
+            <w:tcW w:w="3145" w:type="dxa"/>
           </w:tcPr>
           <w:p>
             <w:pPr>
@@ -221,7 +236,7 @@
         </w:tc>
         <w:tc>
           <w:tcPr>
-            <w:tcW w:w="6511" w:type="dxa"/>
+            <w:tcW w:w="5881" w:type="dxa"/>
           </w:tcPr>
           <w:p>
             <w:pPr>
@@ -267,7 +282,7 @@
       <w:tr>
         <w:tc>
           <w:tcPr>
-            <w:tcW w:w="2515" w:type="dxa"/>
+            <w:tcW w:w="3145" w:type="dxa"/>
           </w:tcPr>
           <w:p>
             <w:pPr>
@@ -293,7 +308,7 @@
         </w:tc>
         <w:tc>
           <w:tcPr>
-            <w:tcW w:w="6511" w:type="dxa"/>
+            <w:tcW w:w="5881" w:type="dxa"/>
           </w:tcPr>
           <w:p>
             <w:pPr>
@@ -319,7 +334,7 @@
       <w:tr>
         <w:tc>
           <w:tcPr>
-            <w:tcW w:w="2515" w:type="dxa"/>
+            <w:tcW w:w="3145" w:type="dxa"/>
           </w:tcPr>
           <w:p>
             <w:pPr>
@@ -345,7 +360,7 @@
         </w:tc>
         <w:tc>
           <w:tcPr>
-            <w:tcW w:w="6511" w:type="dxa"/>
+            <w:tcW w:w="5881" w:type="dxa"/>
           </w:tcPr>
           <w:p>
             <w:pPr>
@@ -372,22 +387,550 @@
     </w:tbl>
     <w:p>
       <w:pPr>
+        <w:spacing w:line="276" w:lineRule="auto"/>
+        <w:jc w:val="both"/>
+        <w:rPr>
+          <w:rFonts w:ascii="Times New Roman" w:hAnsi="Times New Roman" w:cs="Times New Roman"/>
+          <w:sz w:val="24"/>
+          <w:szCs w:val="24"/>
+        </w:rPr>
+      </w:pPr>
+    </w:p>
+    <w:p>
+      <w:pPr>
+        <w:spacing w:line="276" w:lineRule="auto"/>
+        <w:jc w:val="both"/>
+        <w:rPr>
+          <w:rFonts w:ascii="Times New Roman" w:hAnsi="Times New Roman" w:cs="Times New Roman"/>
+          <w:sz w:val="24"/>
+          <w:szCs w:val="24"/>
+        </w:rPr>
+      </w:pPr>
+    </w:p>
+    <w:p>
+      <w:pPr>
+        <w:spacing w:after="120" w:line="276" w:lineRule="auto"/>
+        <w:jc w:val="both"/>
+        <w:rPr>
+          <w:rFonts w:ascii="Times New Roman" w:hAnsi="Times New Roman" w:cs="Times New Roman"/>
+          <w:sz w:val="28"/>
+          <w:szCs w:val="28"/>
+        </w:rPr>
+      </w:pPr>
+      <w:r>
+        <w:rPr>
+          <w:rFonts w:ascii="Times New Roman" w:hAnsi="Times New Roman" w:cs="Times New Roman"/>
+          <w:b/>
+          <w:bCs/>
+          <w:sz w:val="28"/>
+          <w:szCs w:val="28"/>
+        </w:rPr>
+        <w:t>Choice of topic</w:t>
+      </w:r>
+    </w:p>
+    <w:p>
+      <w:pPr>
+        <w:snapToGrid w:val="0"/>
+        <w:spacing w:after="120" w:line="276" w:lineRule="auto"/>
+        <w:jc w:val="both"/>
+        <w:rPr>
+          <w:rFonts w:ascii="Times New Roman" w:hAnsi="Times New Roman" w:cs="Times New Roman"/>
+          <w:sz w:val="24"/>
+          <w:szCs w:val="24"/>
+        </w:rPr>
+      </w:pPr>
+      <w:r>
+        <w:rPr>
+          <w:rFonts w:ascii="Times New Roman" w:hAnsi="Times New Roman" w:cs="Times New Roman"/>
+          <w:sz w:val="24"/>
+          <w:szCs w:val="24"/>
+        </w:rPr>
+        <w:t xml:space="preserve">The idea came about because of two observations. The Uptime Institute's industry outage surveys indicate that power and cooling failures continue to be a top cause of data center outages, and most facilities still react to them manually. Also, AWS has discontinued the IoT Analytics, IoT Events and Lookout for Equipment services, so there is no existing AWS reference design for this kind of automation.</w:t>
+      </w:r>
+    </w:p>
+    <w:p>
+      <w:pPr>
+        <w:snapToGrid w:val="0"/>
+        <w:spacing w:after="120" w:line="276" w:lineRule="auto"/>
+        <w:jc w:val="both"/>
+        <w:rPr>
+          <w:rFonts w:ascii="Times New Roman" w:hAnsi="Times New Roman" w:cs="Times New Roman"/>
+          <w:sz w:val="24"/>
+          <w:szCs w:val="24"/>
+        </w:rPr>
+      </w:pPr>
+      <w:r>
+        <w:rPr>
+          <w:rFonts w:ascii="Times New Roman" w:hAnsi="Times New Roman" w:cs="Times New Roman"/>
+          <w:sz w:val="24"/>
+          <w:szCs w:val="24"/>
+        </w:rPr>
+        <w:t xml:space="preserve">This topic interests me because it applies cloud and machine learning techniques to a real-world problem: detecting cooling and power faults before they affect data center services. It helps me grow my professional skills by allowing me to use AWS IoT and serverless computing to monitor infrastructure and to understand how automated responses can be implemented safely.</w:t>
+      </w:r>
+    </w:p>
+    <w:p>
+      <w:pPr>
+        <w:snapToGrid w:val="0"/>
+        <w:spacing w:after="120" w:line="276" w:lineRule="auto"/>
+        <w:jc w:val="both"/>
+        <w:rPr>
+          <w:rFonts w:ascii="Times New Roman" w:hAnsi="Times New Roman" w:cs="Times New Roman"/>
+          <w:sz w:val="24"/>
+          <w:szCs w:val="24"/>
+        </w:rPr>
+      </w:pPr>
+      <w:r>
+        <w:rPr>
+          <w:rFonts w:ascii="Times New Roman" w:hAnsi="Times New Roman" w:cs="Times New Roman"/>
+          <w:sz w:val="24"/>
+          <w:szCs w:val="24"/>
+        </w:rPr>
+        <w:t xml:space="preserve">The goal of this thesis is to design, implement and test a serverless AWS-based framework that uses IoT telemetry to detect faults in data center cooling and power systems and executes predefined remediation actions in a simulated environment. High-risk actions will need human approval to proceed, and each action will be checked and reversed if the fault is not cleared.</w:t>
+      </w:r>
+    </w:p>
+    <w:p>
+      <w:pPr>
+        <w:spacing w:line="276" w:lineRule="auto"/>
+        <w:jc w:val="both"/>
+        <w:rPr>
+          <w:rFonts w:ascii="Times New Roman" w:hAnsi="Times New Roman" w:cs="Times New Roman"/>
+          <w:sz w:val="24"/>
+          <w:szCs w:val="24"/>
+        </w:rPr>
+      </w:pPr>
+    </w:p>
+    <w:p>
+      <w:pPr>
+        <w:spacing w:line="276" w:lineRule="auto"/>
+        <w:jc w:val="both"/>
+        <w:rPr>
+          <w:rFonts w:ascii="Times New Roman" w:hAnsi="Times New Roman" w:cs="Times New Roman"/>
+          <w:sz w:val="24"/>
+          <w:szCs w:val="24"/>
+        </w:rPr>
+      </w:pPr>
+      <w:r>
+        <w:rPr>
+          <w:rFonts w:ascii="Times New Roman" w:hAnsi="Times New Roman" w:cs="Times New Roman"/>
+          <w:sz w:val="24"/>
+          <w:szCs w:val="24"/>
+        </w:rPr>
+        <w:t>Research questions:</w:t>
+      </w:r>
+    </w:p>
+    <w:p>
+      <w:pPr>
+        <w:spacing w:line="276" w:lineRule="auto"/>
+        <w:jc w:val="both"/>
+        <w:rPr>
+          <w:rFonts w:ascii="Times New Roman" w:hAnsi="Times New Roman" w:cs="Times New Roman"/>
+          <w:sz w:val="24"/>
+          <w:szCs w:val="24"/>
+        </w:rPr>
+      </w:pPr>
+      <w:r>
+        <w:rPr>
+          <w:rFonts w:ascii="Times New Roman" w:hAnsi="Times New Roman" w:cs="Times New Roman"/>
+          <w:sz w:val="24"/>
+          <w:szCs w:val="24"/>
+        </w:rPr>
+        <w:t xml:space="preserve">1. How can a serverless AWS architecture handle data center IoT telemetry and coordinate safe remediation in a simulated setting?</w:t>
+      </w:r>
+    </w:p>
+    <w:p>
+      <w:pPr>
+        <w:spacing w:line="276" w:lineRule="auto"/>
+        <w:jc w:val="both"/>
+        <w:rPr>
+          <w:rFonts w:ascii="Times New Roman" w:hAnsi="Times New Roman" w:cs="Times New Roman"/>
+          <w:sz w:val="24"/>
+          <w:szCs w:val="24"/>
+        </w:rPr>
+      </w:pPr>
+      <w:r>
+        <w:rPr>
+          <w:rFonts w:ascii="Times New Roman" w:hAnsi="Times New Roman" w:cs="Times New Roman"/>
+          <w:sz w:val="24"/>
+          <w:szCs w:val="24"/>
+        </w:rPr>
+        <w:t xml:space="preserve">2. How do Isolation Forest and an LSTM autoencoder compare with static thresholds in detection rate, detection time and false alarm rate?</w:t>
+      </w:r>
+    </w:p>
+    <w:p>
+      <w:pPr>
+        <w:spacing w:line="276" w:lineRule="auto"/>
+        <w:jc w:val="both"/>
+        <w:rPr>
+          <w:rFonts w:ascii="Times New Roman" w:hAnsi="Times New Roman" w:cs="Times New Roman"/>
+          <w:sz w:val="24"/>
+          <w:szCs w:val="24"/>
+        </w:rPr>
+      </w:pPr>
+      <w:r>
+        <w:rPr>
+          <w:rFonts w:ascii="Times New Roman" w:hAnsi="Times New Roman" w:cs="Times New Roman"/>
+          <w:sz w:val="24"/>
+          <w:szCs w:val="24"/>
+        </w:rPr>
+        <w:t xml:space="preserve">3. Does automated remediation improve recovery time compared with an alert-only approach in controlled fault-injection experiments, and how does the framework perform in terms of end-to-end latency, scalability and AWS cost?</w:t>
+      </w:r>
+    </w:p>
+    <w:p>
+      <w:pPr>
+        <w:spacing w:line="276" w:lineRule="auto"/>
+        <w:jc w:val="both"/>
+        <w:rPr>
+          <w:rFonts w:ascii="Times New Roman" w:hAnsi="Times New Roman" w:cs="Times New Roman"/>
+          <w:sz w:val="24"/>
+          <w:szCs w:val="24"/>
+        </w:rPr>
+      </w:pPr>
+    </w:p>
+    <w:p>
+      <w:pPr>
+        <w:spacing w:line="276" w:lineRule="auto"/>
+        <w:jc w:val="both"/>
+        <w:rPr>
+          <w:rFonts w:ascii="Times New Roman" w:hAnsi="Times New Roman" w:cs="Times New Roman"/>
+          <w:sz w:val="24"/>
+          <w:szCs w:val="24"/>
+        </w:rPr>
+      </w:pPr>
+    </w:p>
+    <w:p>
+      <w:pPr>
+        <w:spacing w:line="276" w:lineRule="auto"/>
+        <w:jc w:val="both"/>
+        <w:rPr>
+          <w:rFonts w:ascii="Times New Roman" w:hAnsi="Times New Roman" w:cs="Times New Roman"/>
+          <w:sz w:val="24"/>
+          <w:szCs w:val="24"/>
+        </w:rPr>
+      </w:pPr>
+    </w:p>
+    <w:p>
+      <w:pPr>
+        <w:spacing w:line="276" w:lineRule="auto"/>
+        <w:jc w:val="both"/>
+        <w:rPr>
+          <w:rFonts w:ascii="Times New Roman" w:hAnsi="Times New Roman" w:cs="Times New Roman"/>
+          <w:sz w:val="24"/>
+          <w:szCs w:val="24"/>
+        </w:rPr>
+      </w:pPr>
+    </w:p>
+    <w:p>
+      <w:pPr>
+        <w:spacing w:after="120" w:line="276" w:lineRule="auto"/>
+        <w:jc w:val="both"/>
+        <w:rPr>
+          <w:rFonts w:ascii="Times New Roman" w:hAnsi="Times New Roman" w:cs="Times New Roman"/>
+          <w:b/>
+          <w:bCs/>
+          <w:sz w:val="28"/>
+          <w:szCs w:val="28"/>
+        </w:rPr>
+      </w:pPr>
+      <w:r>
+        <w:rPr>
+          <w:rFonts w:ascii="Times New Roman" w:hAnsi="Times New Roman" w:cs="Times New Roman"/>
+          <w:b/>
+          <w:bCs/>
+          <w:sz w:val="28"/>
+          <w:szCs w:val="28"/>
+        </w:rPr>
+        <w:lastRenderedPageBreak/>
+        <w:t>Thesis methods and implementation</w:t>
+      </w:r>
+    </w:p>
+    <w:p>
+      <w:pPr>
+        <w:snapToGrid w:val="0"/>
+        <w:spacing w:after="120" w:line="276" w:lineRule="auto"/>
+        <w:jc w:val="both"/>
+        <w:rPr>
+          <w:rFonts w:ascii="Times New Roman" w:hAnsi="Times New Roman" w:cs="Times New Roman"/>
+          <w:sz w:val="24"/>
+          <w:szCs w:val="24"/>
+        </w:rPr>
+      </w:pPr>
+      <w:r>
+        <w:rPr>
+          <w:rFonts w:ascii="Times New Roman" w:hAnsi="Times New Roman" w:cs="Times New Roman"/>
+          <w:sz w:val="24"/>
+          <w:szCs w:val="24"/>
+        </w:rPr>
+        <w:t xml:space="preserve">This development study uses the Design Science Research (DSR) methodology, in which the framework is designed as an artifact and tested through controlled experiments. The work has six parts:</w:t>
+      </w:r>
+    </w:p>
+    <w:p>
+      <w:pPr>
+        <w:snapToGrid w:val="0"/>
+        <w:spacing w:after="120" w:line="276" w:lineRule="auto"/>
+        <w:jc w:val="both"/>
+        <w:rPr>
+          <w:rFonts w:ascii="Times New Roman" w:hAnsi="Times New Roman" w:cs="Times New Roman"/>
+          <w:sz w:val="24"/>
+          <w:szCs w:val="24"/>
+        </w:rPr>
+      </w:pPr>
+      <w:r>
+        <w:rPr>
+          <w:rFonts w:ascii="Times New Roman" w:hAnsi="Times New Roman" w:cs="Times New Roman"/>
+          <w:sz w:val="24"/>
+          <w:szCs w:val="24"/>
+        </w:rPr>
+        <w:t xml:space="preserve">1. A literature review on data center monitoring, cloud IoT, anomaly detection and self-healing systems.</w:t>
+      </w:r>
+    </w:p>
+    <w:p>
+      <w:pPr>
+        <w:snapToGrid w:val="0"/>
+        <w:spacing w:after="120" w:line="276" w:lineRule="auto"/>
+        <w:jc w:val="both"/>
+        <w:rPr>
+          <w:rFonts w:ascii="Times New Roman" w:hAnsi="Times New Roman" w:cs="Times New Roman"/>
+          <w:sz w:val="24"/>
+          <w:szCs w:val="24"/>
+        </w:rPr>
+      </w:pPr>
+      <w:r>
+        <w:rPr>
+          <w:rFonts w:ascii="Times New Roman" w:hAnsi="Times New Roman" w:cs="Times New Roman"/>
+          <w:sz w:val="24"/>
+          <w:szCs w:val="24"/>
+        </w:rPr>
+        <w:t xml:space="preserve">2. A simulator of a 20-rack data hall and its main cooling and power equipment: cooling units, pumps, uninterruptible power supplies (UPSs) and power distribution units (PDUs). It will provide IoT telemetry and enable controlled fault injection with known ground truth.</w:t>
+      </w:r>
+    </w:p>
+    <w:p>
+      <w:pPr>
+        <w:snapToGrid w:val="0"/>
+        <w:spacing w:after="120" w:line="276" w:lineRule="auto"/>
+        <w:jc w:val="both"/>
+        <w:rPr>
+          <w:rFonts w:ascii="Times New Roman" w:hAnsi="Times New Roman" w:cs="Times New Roman"/>
+          <w:sz w:val="24"/>
+          <w:szCs w:val="24"/>
+        </w:rPr>
+      </w:pPr>
+      <w:r>
+        <w:rPr>
+          <w:rFonts w:ascii="Times New Roman" w:hAnsi="Times New Roman" w:cs="Times New Roman"/>
+          <w:sz w:val="24"/>
+          <w:szCs w:val="24"/>
+        </w:rPr>
+        <w:t xml:space="preserve">3. An AWS CDK-defined cloud pipeline that uses AWS IoT Core, AWS Lambda, Amazon DynamoDB, Amazon EventBridge, AWS Step Functions, Amazon SNS and Amazon CloudWatch.</w:t>
+      </w:r>
+    </w:p>
+    <w:p>
+      <w:pPr>
+        <w:snapToGrid w:val="0"/>
+        <w:spacing w:after="120" w:line="276" w:lineRule="auto"/>
+        <w:jc w:val="both"/>
+        <w:rPr>
+          <w:rFonts w:ascii="Times New Roman" w:hAnsi="Times New Roman" w:cs="Times New Roman"/>
+          <w:sz w:val="24"/>
+          <w:szCs w:val="24"/>
+        </w:rPr>
+      </w:pPr>
+      <w:r>
+        <w:rPr>
+          <w:rFonts w:ascii="Times New Roman" w:hAnsi="Times New Roman" w:cs="Times New Roman"/>
+          <w:sz w:val="24"/>
+          <w:szCs w:val="24"/>
+        </w:rPr>
+        <w:t xml:space="preserve">4. A comparison of static thresholds, Isolation Forest and an LSTM autoencoder. The public SKAB pump dataset (Skoltech Anomaly Benchmark) will be used as an external benchmark. Its results will be reported separately from the simulator results, since the dataset covers only pumps and not the entire data center context.</w:t>
+      </w:r>
+    </w:p>
+    <w:p>
+      <w:pPr>
+        <w:snapToGrid w:val="0"/>
+        <w:spacing w:after="120" w:line="276" w:lineRule="auto"/>
+        <w:jc w:val="both"/>
+        <w:rPr>
+          <w:rFonts w:ascii="Times New Roman" w:hAnsi="Times New Roman" w:cs="Times New Roman"/>
+          <w:sz w:val="24"/>
+          <w:szCs w:val="24"/>
+        </w:rPr>
+      </w:pPr>
+      <w:r>
+        <w:rPr>
+          <w:rFonts w:ascii="Times New Roman" w:hAnsi="Times New Roman" w:cs="Times New Roman"/>
+          <w:sz w:val="24"/>
+          <w:szCs w:val="24"/>
+        </w:rPr>
+        <w:t xml:space="preserve">5. Remediation playbooks with safety controls such as asset locks, risk tiers, human approval, action verification, rollback, a circuit breaker and rate limits. Remediation will affect the simulator state only; control of real equipment is outside the scope of this thesis.</w:t>
+      </w:r>
+    </w:p>
+    <w:p>
+      <w:pPr>
+        <w:snapToGrid w:val="0"/>
+        <w:spacing w:after="120" w:line="276" w:lineRule="auto"/>
+        <w:jc w:val="both"/>
+        <w:rPr>
+          <w:rFonts w:ascii="Times New Roman" w:hAnsi="Times New Roman" w:cs="Times New Roman"/>
+          <w:sz w:val="24"/>
+          <w:szCs w:val="24"/>
+        </w:rPr>
+      </w:pPr>
+      <w:r>
+        <w:rPr>
+          <w:rFonts w:ascii="Times New Roman" w:hAnsi="Times New Roman" w:cs="Times New Roman"/>
+          <w:sz w:val="24"/>
+          <w:szCs w:val="24"/>
+        </w:rPr>
+        <w:t xml:space="preserve">6. Fault-injection experiments that compare alert-only response, threshold-based automatic remediation and ML-based automatic remediation across eight fault types and three severity levels. The experiments will measure detection and recovery times, false alarms, end-to-end latency, throughput under load and AWS cost.</w:t>
+      </w:r>
+    </w:p>
+    <w:p>
+      <w:pPr>
+        <w:snapToGrid w:val="0"/>
+        <w:spacing w:after="120" w:line="276" w:lineRule="auto"/>
+        <w:jc w:val="both"/>
+        <w:rPr>
+          <w:rFonts w:ascii="Times New Roman" w:hAnsi="Times New Roman" w:cs="Times New Roman"/>
+          <w:sz w:val="24"/>
+          <w:szCs w:val="24"/>
+        </w:rPr>
+      </w:pPr>
+      <w:r>
+        <w:rPr>
+          <w:rFonts w:ascii="Times New Roman" w:hAnsi="Times New Roman" w:cs="Times New Roman"/>
+          <w:sz w:val="24"/>
+          <w:szCs w:val="24"/>
+        </w:rPr>
+        <w:t xml:space="preserve">The quantitative evaluation is based on eight hypotheses with clear pass criteria, and the criteria for each experiment are set before it is run. Results will be presented as medians with bootstrapped confidence intervals, and planned pairwise comparisons will be made with the Mann–Whitney U test with Holm correction. The data will be obtained from the simulator, the public SKAB dataset and AWS measurements. No human subjects or personal data are involved in the study.</w:t>
+      </w:r>
+    </w:p>
+    <w:p>
+      <w:pPr>
+        <w:snapToGrid w:val="0"/>
+        <w:spacing w:after="120" w:line="276" w:lineRule="auto"/>
+        <w:jc w:val="both"/>
+        <w:rPr>
+          <w:rFonts w:ascii="Times New Roman" w:hAnsi="Times New Roman" w:cs="Times New Roman"/>
+          <w:sz w:val="24"/>
+          <w:szCs w:val="24"/>
+        </w:rPr>
+      </w:pPr>
+    </w:p>
+    <w:p>
+      <w:pPr>
+        <w:spacing w:after="120" w:line="276" w:lineRule="auto"/>
+        <w:jc w:val="both"/>
+        <w:rPr>
+          <w:rFonts w:ascii="Times New Roman" w:hAnsi="Times New Roman" w:cs="Times New Roman"/>
+          <w:b/>
+          <w:bCs/>
+          <w:sz w:val="28"/>
+          <w:szCs w:val="28"/>
+        </w:rPr>
+      </w:pPr>
+      <w:r>
+        <w:rPr>
+          <w:rFonts w:ascii="Times New Roman" w:hAnsi="Times New Roman" w:cs="Times New Roman"/>
+          <w:b/>
+          <w:bCs/>
+          <w:sz w:val="28"/>
+          <w:szCs w:val="28"/>
+        </w:rPr>
+        <w:t>Relevance of the thesis project</w:t>
+      </w:r>
+    </w:p>
+    <w:p>
+      <w:pPr>
+        <w:snapToGrid w:val="0"/>
+        <w:spacing w:after="120" w:line="276" w:lineRule="auto"/>
+        <w:jc w:val="both"/>
+        <w:rPr>
+          <w:rFonts w:ascii="Times New Roman" w:hAnsi="Times New Roman" w:cs="Times New Roman"/>
+          <w:sz w:val="24"/>
+          <w:szCs w:val="24"/>
+        </w:rPr>
+      </w:pPr>
+      <w:r>
+        <w:rPr>
+          <w:rFonts w:ascii="Times New Roman" w:hAnsi="Times New Roman" w:cs="Times New Roman"/>
+          <w:sz w:val="24"/>
+          <w:szCs w:val="24"/>
+        </w:rPr>
+        <w:t xml:space="preserve">The project will give me hands-on experience with cloud architecture on AWS, IoT connectivity, infrastructure as code, and event-driven, serverless design. It will also strengthen my skills in machine-learning anomaly detection, safe automation, experimental design, statistical analysis, cloud cost analysis and technical writing, and grow my understanding of data center cooling and power operations.</w:t>
+      </w:r>
+    </w:p>
+    <w:p>
+      <w:pPr>
+        <w:snapToGrid w:val="0"/>
+        <w:spacing w:after="120" w:line="276" w:lineRule="auto"/>
+        <w:jc w:val="both"/>
+        <w:rPr>
+          <w:rFonts w:ascii="Times New Roman" w:hAnsi="Times New Roman" w:cs="Times New Roman"/>
+          <w:sz w:val="24"/>
+          <w:szCs w:val="24"/>
+        </w:rPr>
+      </w:pPr>
+    </w:p>
+    <w:p>
+      <w:pPr>
+        <w:snapToGrid w:val="0"/>
+        <w:spacing w:after="120" w:line="276" w:lineRule="auto"/>
+        <w:jc w:val="both"/>
+        <w:rPr>
+          <w:rFonts w:ascii="Times New Roman" w:hAnsi="Times New Roman" w:cs="Times New Roman"/>
+          <w:sz w:val="24"/>
+          <w:szCs w:val="24"/>
+        </w:rPr>
+      </w:pPr>
+    </w:p>
+    <w:p>
+      <w:pPr>
+        <w:snapToGrid w:val="0"/>
+        <w:spacing w:after="120" w:line="276" w:lineRule="auto"/>
+        <w:jc w:val="both"/>
+        <w:rPr>
+          <w:rFonts w:ascii="Times New Roman" w:hAnsi="Times New Roman" w:cs="Times New Roman"/>
+          <w:b/>
+          <w:bCs/>
+          <w:sz w:val="24"/>
+          <w:szCs w:val="24"/>
+        </w:rPr>
+      </w:pPr>
+    </w:p>
+    <w:p>
+      <w:pPr>
         <w:pStyle w:val="Heading2"/>
-        <w:keepNext/>
-        <w:pBdr>
-          <w:bottom w:val="single" w:sz="4" w:space="4" w:color="D9D9D9"/>
-        </w:pBdr>
-        <w:spacing w:before="360" w:after="80"/>
-        <w:rPr>
-          <w:b w:val="0"/>
-          <w:bCs w:val="0"/>
-          <w:color w:val="C2410C"/>
-          <w:sz w:val="18"/>
-          <w:szCs w:val="18"/>
-        </w:rPr>
-      </w:pPr>
-      <w:r>
-        <w:t>Choice of topic</w:t>
+        <w:spacing w:after="120"/>
+        <w:rPr>
+          <w:rFonts w:ascii="Times New Roman" w:hAnsi="Times New Roman" w:cs="Times New Roman"/>
+          <w:sz w:val="28"/>
+          <w:szCs w:val="28"/>
+        </w:rPr>
+      </w:pPr>
+      <w:r>
+        <w:rPr>
+          <w:rFonts w:ascii="Times New Roman" w:hAnsi="Times New Roman" w:cs="Times New Roman"/>
+          <w:sz w:val="28"/>
+          <w:szCs w:val="28"/>
+        </w:rPr>
+        <w:lastRenderedPageBreak/>
+        <w:t>Commissioning information</w:t>
+      </w:r>
+    </w:p>
+    <w:p>
+      <w:pPr>
+        <w:rPr>
+          <w:rFonts w:ascii="Times New Roman" w:hAnsi="Times New Roman" w:cs="Times New Roman"/>
+          <w:sz w:val="24"/>
+          <w:szCs w:val="24"/>
+        </w:rPr>
+      </w:pPr>
+      <w:r>
+        <w:rPr>
+          <w:rFonts w:ascii="Times New Roman" w:hAnsi="Times New Roman" w:cs="Times New Roman"/>
+          <w:sz w:val="24"/>
+          <w:szCs w:val="24"/>
+        </w:rPr>
+        <w:t>None. The topic is self-initiated, so the commissioning fields are left blank.</w:t>
       </w:r>
     </w:p>
     <w:p>
@@ -400,13 +943,28 @@
           <w:szCs w:val="24"/>
         </w:rPr>
       </w:pPr>
-      <w:r>
-        <w:rPr>
-          <w:rFonts w:ascii="Times New Roman" w:hAnsi="Times New Roman" w:cs="Times New Roman"/>
-          <w:sz w:val="24"/>
-          <w:szCs w:val="24"/>
-        </w:rPr>
-        <w:t xml:space="preserve">The topic is self-initiated, and the thesis has no commissioner. Potential commissioners include data center operators, colocation providers, and cloud consultancies that monitor facility infrastructure. The topic arose from two observations. Industry outage surveys by the Uptime Institute show that power and cooling failures remain a leading cause of costly data center outages, yet most facilities still respond to them manually. In addition, AWS has retired IoT Analytics, IoT Events, and Lookout for Equipment, which leaves no current AWS reference design for this type of automation.</w:t>
+    </w:p>
+    <w:p>
+      <w:pPr>
+        <w:spacing w:after="120" w:line="276" w:lineRule="auto"/>
+        <w:jc w:val="both"/>
+        <w:rPr>
+          <w:rFonts w:ascii="Times New Roman" w:hAnsi="Times New Roman" w:cs="Times New Roman"/>
+          <w:b/>
+          <w:bCs/>
+          <w:sz w:val="24"/>
+          <w:szCs w:val="24"/>
+        </w:rPr>
+      </w:pPr>
+      <w:r>
+        <w:rPr>
+          <w:rFonts w:ascii="Times New Roman" w:hAnsi="Times New Roman" w:cs="Times New Roman"/>
+          <w:b/>
+          <w:bCs/>
+          <w:sz w:val="28"/>
+          <w:szCs w:val="28"/>
+        </w:rPr>
+        <w:t>Relevant preparation and experience</w:t>
       </w:r>
     </w:p>
     <w:p>
@@ -419,446 +977,13 @@
           <w:szCs w:val="24"/>
         </w:rPr>
       </w:pPr>
-    </w:p>
-    <w:p>
-      <w:pPr>
-        <w:spacing w:line="276" w:lineRule="auto"/>
-        <w:jc w:val="both"/>
-        <w:rPr>
-          <w:rFonts w:ascii="Times New Roman" w:hAnsi="Times New Roman" w:cs="Times New Roman"/>
-          <w:sz w:val="24"/>
-          <w:szCs w:val="24"/>
-        </w:rPr>
-      </w:pPr>
-      <w:r>
-        <w:rPr>
-          <w:rFonts w:ascii="Times New Roman" w:hAnsi="Times New Roman" w:cs="Times New Roman"/>
-          <w:sz w:val="24"/>
-          <w:szCs w:val="24"/>
-        </w:rPr>
-        <w:t xml:space="preserve">This topic interests me because it applies cloud and machine-learning methods to a practical problem: detecting cooling and power faults before they disrupt data center services. It supports my professional development because it lets me apply AWS IoT and serverless computing to infrastructure monitoring and study how automated responses can be made safe.</w:t>
-      </w:r>
-    </w:p>
-    <w:p>
-      <w:pPr>
-        <w:spacing w:line="276" w:lineRule="auto"/>
-        <w:jc w:val="both"/>
-        <w:rPr>
-          <w:rFonts w:ascii="Times New Roman" w:hAnsi="Times New Roman" w:cs="Times New Roman"/>
-          <w:sz w:val="24"/>
-          <w:szCs w:val="24"/>
-        </w:rPr>
-      </w:pPr>
-    </w:p>
-    <w:p>
-      <w:pPr>
-        <w:spacing w:line="276" w:lineRule="auto"/>
-        <w:jc w:val="both"/>
-        <w:rPr>
-          <w:rFonts w:ascii="Times New Roman" w:hAnsi="Times New Roman" w:cs="Times New Roman"/>
-          <w:sz w:val="24"/>
-          <w:szCs w:val="24"/>
-        </w:rPr>
-      </w:pPr>
-      <w:r>
-        <w:rPr>
-          <w:rFonts w:ascii="Times New Roman" w:hAnsi="Times New Roman" w:cs="Times New Roman"/>
-          <w:sz w:val="24"/>
-          <w:szCs w:val="24"/>
-        </w:rPr>
-        <w:t xml:space="preserve">The aim of this thesis is to design, implement, and evaluate a serverless AWS framework that uses IoT telemetry to detect faults in data center cooling and power systems and to execute predefined remediation actions in a simulated environment. High-risk actions will require human approval, and every action will be verified and rolled back if it does not resolve the fault.</w:t>
-      </w:r>
-    </w:p>
-    <w:p>
-      <w:pPr>
-        <w:jc w:val="both"/>
-        <w:rPr>
-          <w:rFonts w:ascii="Times New Roman" w:hAnsi="Times New Roman" w:cs="Times New Roman"/>
-          <w:sz w:val="24"/>
-          <w:szCs w:val="24"/>
-        </w:rPr>
-      </w:pPr>
-    </w:p>
-    <w:p>
-      <w:pPr>
-        <w:spacing w:line="276" w:lineRule="auto"/>
-        <w:jc w:val="both"/>
-        <w:rPr>
-          <w:rFonts w:ascii="Times New Roman" w:hAnsi="Times New Roman" w:cs="Times New Roman"/>
-          <w:sz w:val="24"/>
-          <w:szCs w:val="24"/>
-        </w:rPr>
-      </w:pPr>
-      <w:r>
-        <w:rPr>
-          <w:rFonts w:ascii="Times New Roman" w:hAnsi="Times New Roman" w:cs="Times New Roman"/>
-          <w:sz w:val="24"/>
-          <w:szCs w:val="24"/>
-        </w:rPr>
-        <w:t>Research questions:</w:t>
-      </w:r>
-    </w:p>
-    <w:p>
-      <w:pPr>
-        <w:spacing w:line="276" w:lineRule="auto"/>
-        <w:ind w:left="360" w:hanging="360"/>
-        <w:jc w:val="both"/>
-        <w:rPr>
-          <w:rFonts w:ascii="Times New Roman" w:hAnsi="Times New Roman" w:cs="Times New Roman"/>
-          <w:sz w:val="24"/>
-          <w:szCs w:val="24"/>
-        </w:rPr>
-      </w:pPr>
-      <w:r>
-        <w:rPr>
-          <w:rFonts w:ascii="Times New Roman" w:hAnsi="Times New Roman" w:cs="Times New Roman"/>
-          <w:sz w:val="24"/>
-          <w:szCs w:val="24"/>
-        </w:rPr>
-        <w:t>(1) How can a serverless AWS architecture process data center IoT telemetry and coordinate safe remediation in a simulated environment?</w:t>
-      </w:r>
-    </w:p>
-    <w:p>
-      <w:pPr>
-        <w:spacing w:line="276" w:lineRule="auto"/>
-        <w:ind w:left="360" w:hanging="360"/>
-        <w:jc w:val="both"/>
-        <w:rPr>
-          <w:rFonts w:ascii="Times New Roman" w:hAnsi="Times New Roman" w:cs="Times New Roman"/>
-          <w:sz w:val="24"/>
-          <w:szCs w:val="24"/>
-        </w:rPr>
-      </w:pPr>
-      <w:r>
-        <w:rPr>
-          <w:rFonts w:ascii="Times New Roman" w:hAnsi="Times New Roman" w:cs="Times New Roman"/>
-          <w:sz w:val="24"/>
-          <w:szCs w:val="24"/>
-        </w:rPr>
-        <w:t>(2) How do Isolation Forest and an LSTM autoencoder compare with static thresholds in detection rate, detection time, and false-alarm rate?</w:t>
-      </w:r>
-    </w:p>
-    <w:p>
-      <w:pPr>
-        <w:spacing w:line="276" w:lineRule="auto"/>
-        <w:ind w:left="360" w:hanging="360"/>
-        <w:jc w:val="both"/>
-        <w:rPr>
-          <w:rFonts w:ascii="Times New Roman" w:hAnsi="Times New Roman" w:cs="Times New Roman"/>
-          <w:sz w:val="24"/>
-          <w:szCs w:val="24"/>
-        </w:rPr>
-      </w:pPr>
-      <w:r>
-        <w:rPr>
-          <w:rFonts w:ascii="Times New Roman" w:hAnsi="Times New Roman" w:cs="Times New Roman"/>
-          <w:sz w:val="24"/>
-          <w:szCs w:val="24"/>
-        </w:rPr>
-        <w:t xml:space="preserve">(3) How does automated remediation affect recovery time compared with an alert-only response in controlled fault-injection experiments, and how does the framework perform in terms of end-to-end latency, scalability, and AWS cost?</w:t>
-      </w:r>
-    </w:p>
-    <w:p>
-      <w:pPr>
-        <w:pStyle w:val="Heading2"/>
-        <w:keepNext/>
-        <w:pBdr>
-          <w:bottom w:val="single" w:sz="4" w:space="4" w:color="D9D9D9"/>
-        </w:pBdr>
-        <w:spacing w:before="360" w:after="80"/>
-      </w:pPr>
-      <w:r>
-        <w:t>Thesis methods and implementation</w:t>
-      </w:r>
-    </w:p>
-    <w:p>
-      <w:pPr>
-        <w:spacing w:line="276" w:lineRule="auto"/>
-        <w:jc w:val="both"/>
-        <w:rPr>
-          <w:rFonts w:ascii="Times New Roman" w:hAnsi="Times New Roman" w:cs="Times New Roman"/>
-          <w:sz w:val="24"/>
-          <w:szCs w:val="24"/>
-        </w:rPr>
-      </w:pPr>
-      <w:r>
-        <w:rPr>
-          <w:rFonts w:ascii="Times New Roman" w:hAnsi="Times New Roman" w:cs="Times New Roman"/>
-          <w:sz w:val="24"/>
-          <w:szCs w:val="24"/>
-        </w:rPr>
-        <w:t xml:space="preserve">This research-oriented development study will follow the Design Science Research methodology, in which the framework is built as an artifact and evaluated through controlled experiments. The work consists of six parts:</w:t>
-      </w:r>
-    </w:p>
-    <w:p>
-      <w:pPr>
-        <w:spacing w:line="276" w:lineRule="auto"/>
-        <w:jc w:val="both"/>
-        <w:rPr>
-          <w:rFonts w:ascii="Times New Roman" w:hAnsi="Times New Roman" w:cs="Times New Roman"/>
-          <w:sz w:val="24"/>
-          <w:szCs w:val="24"/>
-        </w:rPr>
-      </w:pPr>
-      <w:r>
-        <w:rPr>
-          <w:rFonts w:ascii="Times New Roman" w:hAnsi="Times New Roman" w:cs="Times New Roman"/>
-          <w:sz w:val="24"/>
-          <w:szCs w:val="24"/>
-        </w:rPr>
-        <w:t>(1) A literature review of data center monitoring, cloud IoT, anomaly detection, and self-healing systems.</w:t>
-      </w:r>
-    </w:p>
-    <w:p>
-      <w:pPr>
-        <w:spacing w:line="276" w:lineRule="auto"/>
-        <w:jc w:val="both"/>
-        <w:rPr>
-          <w:rFonts w:ascii="Times New Roman" w:hAnsi="Times New Roman" w:cs="Times New Roman"/>
-          <w:sz w:val="24"/>
-          <w:szCs w:val="24"/>
-        </w:rPr>
-      </w:pPr>
-      <w:r>
-        <w:rPr>
-          <w:rFonts w:ascii="Times New Roman" w:hAnsi="Times New Roman" w:cs="Times New Roman"/>
-          <w:sz w:val="24"/>
-          <w:szCs w:val="24"/>
-        </w:rPr>
-        <w:t xml:space="preserve">(2) A simulator of a 20-rack data hall and its main cooling and power assets: cooling units, pumps, uninterruptible power supplies (UPSs), and power distribution units (PDUs). It will publish IoT telemetry and support controlled fault injection with known ground truth.</w:t>
-      </w:r>
-    </w:p>
-    <w:p>
-      <w:pPr>
-        <w:spacing w:line="276" w:lineRule="auto"/>
-        <w:jc w:val="both"/>
-        <w:rPr>
-          <w:rFonts w:ascii="Times New Roman" w:hAnsi="Times New Roman" w:cs="Times New Roman"/>
-          <w:sz w:val="24"/>
-          <w:szCs w:val="24"/>
-        </w:rPr>
-      </w:pPr>
-      <w:r>
-        <w:rPr>
-          <w:rFonts w:ascii="Times New Roman" w:hAnsi="Times New Roman" w:cs="Times New Roman"/>
-          <w:sz w:val="24"/>
-          <w:szCs w:val="24"/>
-        </w:rPr>
-        <w:t xml:space="preserve">(3) A cloud pipeline defined as infrastructure as code with the AWS CDK, using AWS IoT Core, AWS Lambda, Amazon DynamoDB, Amazon EventBridge, AWS Step Functions, Amazon SNS, and Amazon CloudWatch.</w:t>
-      </w:r>
-    </w:p>
-    <w:p>
-      <w:pPr>
-        <w:spacing w:line="276" w:lineRule="auto"/>
-        <w:jc w:val="both"/>
-        <w:rPr>
-          <w:rFonts w:ascii="Times New Roman" w:hAnsi="Times New Roman" w:cs="Times New Roman"/>
-          <w:sz w:val="24"/>
-          <w:szCs w:val="24"/>
-        </w:rPr>
-      </w:pPr>
-      <w:r>
-        <w:rPr>
-          <w:rFonts w:ascii="Times New Roman" w:hAnsi="Times New Roman" w:cs="Times New Roman"/>
-          <w:sz w:val="24"/>
-          <w:szCs w:val="24"/>
-        </w:rPr>
-        <w:t xml:space="preserve">(4) A comparison of static thresholds, Isolation Forest, and an LSTM autoencoder. The public SKAB pump dataset (Skoltech Anomaly Benchmark) will serve as an external benchmark. Its results will be reported apart from the simulator results because it covers pumps only, not the full data center context.</w:t>
-      </w:r>
-    </w:p>
-    <w:p>
-      <w:pPr>
-        <w:spacing w:line="276" w:lineRule="auto"/>
-        <w:jc w:val="both"/>
-        <w:rPr>
-          <w:rFonts w:ascii="Times New Roman" w:hAnsi="Times New Roman" w:cs="Times New Roman"/>
-          <w:sz w:val="24"/>
-          <w:szCs w:val="24"/>
-        </w:rPr>
-      </w:pPr>
-      <w:r>
-        <w:rPr>
-          <w:rFonts w:ascii="Times New Roman" w:hAnsi="Times New Roman" w:cs="Times New Roman"/>
-          <w:sz w:val="24"/>
-          <w:szCs w:val="24"/>
-        </w:rPr>
-        <w:t>(5) Remediation playbooks with safety controls, including asset locks, risk tiers, human approval, action verification, rollback, a circuit breaker, and rate limits. Remediation will change simulator state only; control of physical equipment is outside the scope of this thesis.</w:t>
-      </w:r>
-    </w:p>
-    <w:p>
-      <w:pPr>
-        <w:spacing w:line="276" w:lineRule="auto"/>
-        <w:jc w:val="both"/>
-        <w:rPr>
-          <w:rFonts w:ascii="Times New Roman" w:hAnsi="Times New Roman" w:cs="Times New Roman"/>
-          <w:sz w:val="24"/>
-          <w:szCs w:val="24"/>
-        </w:rPr>
-      </w:pPr>
-      <w:r>
-        <w:rPr>
-          <w:rFonts w:ascii="Times New Roman" w:hAnsi="Times New Roman" w:cs="Times New Roman"/>
-          <w:sz w:val="24"/>
-          <w:szCs w:val="24"/>
-        </w:rPr>
-        <w:t xml:space="preserve">(6) Fault-injection experiments comparing an alert-only response with threshold-based and ML-based automated remediation across eight fault types and three severity levels. The experiments will measure detection and recovery times, false alarms, end-to-end latency, throughput under load, and AWS cost.</w:t>
-      </w:r>
-    </w:p>
-    <w:p>
-      <w:pPr>
-        <w:spacing w:line="276" w:lineRule="auto"/>
-        <w:jc w:val="both"/>
-        <w:rPr>
-          <w:rFonts w:ascii="Times New Roman" w:hAnsi="Times New Roman" w:cs="Times New Roman"/>
-          <w:sz w:val="24"/>
-          <w:szCs w:val="24"/>
-        </w:rPr>
-      </w:pPr>
-    </w:p>
-    <w:p>
-      <w:pPr>
-        <w:spacing w:line="276" w:lineRule="auto"/>
-        <w:jc w:val="both"/>
-        <w:rPr>
-          <w:rFonts w:ascii="Times New Roman" w:hAnsi="Times New Roman" w:cs="Times New Roman"/>
-          <w:sz w:val="24"/>
-          <w:szCs w:val="24"/>
-        </w:rPr>
-      </w:pPr>
-      <w:r>
-        <w:rPr>
-          <w:rFonts w:ascii="Times New Roman" w:hAnsi="Times New Roman" w:cs="Times New Roman"/>
-          <w:sz w:val="24"/>
-          <w:szCs w:val="24"/>
-        </w:rPr>
-        <w:t xml:space="preserve">The quantitative evaluation is structured around eight hypotheses with explicit pass criteria; the criteria for each experiment are fixed before it is run. Results will be summarized as medians with bootstrap confidence intervals, and planned pairwise comparisons will use Mann–Whitney U tests with Holm correction. Data will come from the simulator, the public SKAB dataset, and AWS measurements. The study involves no human participants or personal data.</w:t>
-      </w:r>
-    </w:p>
-    <w:p>
-      <w:pPr>
-        <w:spacing w:line="276" w:lineRule="auto"/>
-        <w:jc w:val="both"/>
-        <w:rPr>
-          <w:rFonts w:ascii="Times New Roman" w:hAnsi="Times New Roman" w:cs="Times New Roman"/>
-          <w:sz w:val="24"/>
-          <w:szCs w:val="24"/>
-        </w:rPr>
-      </w:pPr>
-    </w:p>
-    <w:p>
-      <w:pPr>
-        <w:spacing w:line="276" w:lineRule="auto"/>
-        <w:jc w:val="both"/>
-        <w:rPr>
-          <w:rFonts w:ascii="Times New Roman" w:hAnsi="Times New Roman" w:cs="Times New Roman"/>
-          <w:sz w:val="24"/>
-          <w:szCs w:val="24"/>
-        </w:rPr>
-      </w:pPr>
-      <w:r>
-        <w:rPr>
-          <w:rFonts w:ascii="Times New Roman" w:hAnsi="Times New Roman" w:cs="Times New Roman"/>
-          <w:sz w:val="24"/>
-          <w:szCs w:val="24"/>
-        </w:rPr>
-        <w:t xml:space="preserve">Preliminary schedule: Sep–Oct 2026, literature review, prototype, and offline experiments; Nov 2026, severity sweep and validation on AWS; Dec 2026–Feb 2027, writing; Mar 2027, final revisions, seminar, and maturity test. Code, data, and results will be maintained in a GitHub repository.</w:t>
-      </w:r>
-    </w:p>
-    <w:p/>
-    <w:p>
-      <w:pPr>
-        <w:pStyle w:val="Heading2"/>
-        <w:keepNext/>
-        <w:pBdr>
-          <w:bottom w:val="single" w:sz="4" w:space="4" w:color="D9D9D9"/>
-        </w:pBdr>
-        <w:spacing w:before="360" w:after="80"/>
-      </w:pPr>
-      <w:r>
-        <w:t>Relevance of the thesis project</w:t>
-      </w:r>
-    </w:p>
-    <w:p>
-      <w:pPr>
-        <w:spacing w:line="276" w:lineRule="auto"/>
-        <w:jc w:val="both"/>
-        <w:rPr>
-          <w:rFonts w:ascii="Times New Roman" w:hAnsi="Times New Roman" w:cs="Times New Roman"/>
-          <w:sz w:val="24"/>
-          <w:szCs w:val="24"/>
-        </w:rPr>
-      </w:pPr>
-      <w:r>
-        <w:rPr>
-          <w:rFonts w:ascii="Times New Roman" w:hAnsi="Times New Roman" w:cs="Times New Roman"/>
-          <w:sz w:val="24"/>
-          <w:szCs w:val="24"/>
-        </w:rPr>
-        <w:t xml:space="preserve">The project will develop my practical skills in AWS cloud architecture, IoT connectivity (MQTT, X.509 certificates, and device shadows), infrastructure as code, and serverless, event-driven design. It will also strengthen my skills in machine-learning anomaly detection, safe automation, experimental design, statistical analysis, cloud cost analysis, and technical writing, and build my knowledge of data center cooling and power operations.</w:t>
-      </w:r>
-    </w:p>
-    <w:p>
-      <w:pPr>
-        <w:pStyle w:val="Heading2"/>
-        <w:keepNext/>
-        <w:pBdr>
-          <w:bottom w:val="single" w:sz="4" w:space="4" w:color="D9D9D9"/>
-        </w:pBdr>
-        <w:spacing w:before="360" w:after="80"/>
-      </w:pPr>
-      <w:r>
-        <w:t>Commissioning information</w:t>
-      </w:r>
-    </w:p>
-    <w:p>
-      <w:pPr>
-        <w:spacing w:line="276" w:lineRule="auto"/>
-        <w:jc w:val="both"/>
-        <w:rPr>
-          <w:rFonts w:ascii="Times New Roman" w:hAnsi="Times New Roman" w:cs="Times New Roman"/>
-          <w:sz w:val="24"/>
-          <w:szCs w:val="24"/>
-        </w:rPr>
-      </w:pPr>
-      <w:r>
-        <w:rPr>
-          <w:rFonts w:ascii="Times New Roman" w:hAnsi="Times New Roman" w:cs="Times New Roman"/>
-          <w:sz w:val="24"/>
-          <w:szCs w:val="24"/>
-        </w:rPr>
-        <w:t xml:space="preserve">None. The topic is self-initiated, so the commissioning fields are left blank.</w:t>
-      </w:r>
-    </w:p>
-    <w:p>
-      <w:pPr>
-        <w:pStyle w:val="Heading2"/>
-        <w:keepNext/>
-        <w:pBdr>
-          <w:bottom w:val="single" w:sz="4" w:space="4" w:color="D9D9D9"/>
-        </w:pBdr>
-        <w:spacing w:before="360" w:after="80"/>
-      </w:pPr>
-      <w:r>
-        <w:t>Relevant preparation and experience</w:t>
-      </w:r>
-    </w:p>
-    <w:p>
-      <w:pPr>
-        <w:spacing w:line="276" w:lineRule="auto"/>
-        <w:jc w:val="both"/>
-        <w:rPr>
-          <w:rFonts w:ascii="Times New Roman" w:hAnsi="Times New Roman" w:cs="Times New Roman"/>
-          <w:sz w:val="24"/>
-          <w:szCs w:val="24"/>
-        </w:rPr>
-      </w:pPr>
-      <w:r>
-        <w:rPr>
-          <w:rFonts w:ascii="Times New Roman" w:hAnsi="Times New Roman" w:cs="Times New Roman"/>
-          <w:sz w:val="24"/>
-          <w:szCs w:val="24"/>
-        </w:rPr>
-        <w:t xml:space="preserve">The thesis builds on my prior studies in cloud computing, networking, programming, data analysis, and machine learning. It will add practical project experience through implementing the AWS IoT pipeline and the simulator, developing anomaly-detection models, and running quantitative fault-injection experiments.</w:t>
+      <w:r>
+        <w:rPr>
+          <w:rFonts w:ascii="Times New Roman" w:hAnsi="Times New Roman" w:cs="Times New Roman"/>
+          <w:sz w:val="24"/>
+          <w:szCs w:val="24"/>
+        </w:rPr>
+        <w:t xml:space="preserve">The thesis builds on my previous studies in cloud computing, networking, programming, data analysis and machine learning. It will provide hands-on experience in implementing the AWS IoT pipeline and the simulator, building anomaly-detection models and conducting quantitative fault-injection experiments.</w:t>
       </w:r>
     </w:p>
     <w:sectPr>
@@ -1499,6 +1624,7 @@
   </w:style>
   <w:style w:type="paragraph" w:styleId="Heading2">
     <w:name w:val="heading 2"/>
+    <w:link w:val="Heading2Char"/>
     <w:uiPriority w:val="9"/>
     <w:unhideWhenUsed/>
     <w:qFormat/>
@@ -1571,6 +1697,7 @@
   <w:style w:type="character" w:default="1" w:styleId="DefaultParagraphFont">
     <w:name w:val="Default Paragraph Font"/>
     <w:uiPriority w:val="1"/>
+    <w:semiHidden/>
     <w:unhideWhenUsed/>
   </w:style>
   <w:style w:type="table" w:default="1" w:styleId="TableNormal">
@@ -1703,6 +1830,19 @@
         <w:insideV w:val="single" w:sz="4" w:space="0" w:color="auto"/>
       </w:tblBorders>
     </w:tblPr>
+  </w:style>
+  <w:style w:type="character" w:customStyle="1" w:styleId="Heading2Char">
+    <w:name w:val="Heading 2 Char"/>
+    <w:basedOn w:val="DefaultParagraphFont"/>
+    <w:link w:val="Heading2"/>
+    <w:uiPriority w:val="9"/>
+    <w:rsid w:val="002A2764"/>
+    <w:rPr>
+      <w:b/>
+      <w:bCs/>
+      <w:sz w:val="26"/>
+      <w:szCs w:val="26"/>
+    </w:rPr>
   </w:style>
 </w:styles>
 </file>

</xml_diff>